<commit_message>
update: latest BA Uji Administrasi template from user
</commit_message>
<xml_diff>
--- a/src/templates/uji-administrasi/template_ba_uji_admin.docx
+++ b/src/templates/uji-administrasi/template_ba_uji_admin.docx
@@ -11948,8 +11948,8 @@
     <w:tbl>
       <w:tblPr>
         <w:tblStyle w:val="TableGrid"/>
-        <w:tblW w:w="5386" w:type="dxa"/>
-        <w:tblInd w:w="4253" w:type="dxa"/>
+        <w:tblW w:w="6804" w:type="dxa"/>
+        <w:tblInd w:w="2835" w:type="dxa"/>
         <w:tblBorders>
           <w:top w:val="none" w:sz="0" w:space="0" w:color="auto"/>
           <w:left w:val="none" w:sz="0" w:space="0" w:color="auto"/>
@@ -11963,18 +11963,18 @@
       </w:tblPr>
       <w:tblGrid>
         <w:gridCol w:w="850"/>
-        <w:gridCol w:w="3119"/>
-        <w:gridCol w:w="1417"/>
+        <w:gridCol w:w="3970"/>
+        <w:gridCol w:w="1984"/>
       </w:tblGrid>
       <w:tr>
         <w:trPr>
           <w:gridAfter w:val="1"/>
-          <w:wAfter w:w="1417" w:type="dxa"/>
+          <w:wAfter w:w="1984" w:type="dxa"/>
           <w:trHeight w:val="527"/>
         </w:trPr>
         <w:tc>
           <w:tcPr>
-            <w:tcW w:w="3969" w:type="dxa"/>
+            <w:tcW w:w="4820" w:type="dxa"/>
             <w:gridSpan w:val="2"/>
             <w:vAlign w:val="center"/>
           </w:tcPr>
@@ -12168,7 +12168,7 @@
         </w:tc>
         <w:tc>
           <w:tcPr>
-            <w:tcW w:w="3119" w:type="dxa"/>
+            <w:tcW w:w="3970" w:type="dxa"/>
           </w:tcPr>
           <w:p>
             <w:pPr>
@@ -12209,7 +12209,7 @@
         </w:tc>
         <w:tc>
           <w:tcPr>
-            <w:tcW w:w="1417" w:type="dxa"/>
+            <w:tcW w:w="1984" w:type="dxa"/>
           </w:tcPr>
           <w:p>
             <w:pPr>

</xml_diff>